<commit_message>
Testes 6 e 7 feitos, contendo as justificacoes do porquê dos outros nao serem viaveis
</commit_message>
<xml_diff>
--- a/Rabiscos Trabalho 2.docx
+++ b/Rabiscos Trabalho 2.docx
@@ -10,6 +10,9 @@
         <w:br/>
       </w:r>
       <w:r>
+        <w:rPr>
+          <w:noProof/>
+        </w:rPr>
         <w:drawing>
           <wp:inline distT="0" distB="0" distL="0" distR="0" wp14:anchorId="2DF39005" wp14:editId="661DC65B">
             <wp:extent cx="3904091" cy="3635983"/>
@@ -84,21 +87,64 @@
     <w:p/>
     <w:p/>
     <w:p/>
+    <w:p/>
     <w:p>
       <w:r>
         <w:lastRenderedPageBreak/>
         <w:t>Conjunto de testes e gráficos feitos para a seguinte cominação de métodos de evolução:</w:t>
       </w:r>
-      <w:r>
-        <w:br/>
-        <w:t xml:space="preserve">Mutação: </w:t>
-      </w:r>
+    </w:p>
+    <w:p>
+      <w:pPr>
+        <w:rPr>
+          <w:lang w:val="en-GB"/>
+        </w:rPr>
+      </w:pPr>
+      <w:r>
+        <w:rPr>
+          <w:lang w:val="en-GB"/>
+        </w:rPr>
+        <w:t xml:space="preserve">EXPERICIENCIA </w:t>
+      </w:r>
+      <w:r>
+        <w:rPr>
+          <w:lang w:val="en-GB"/>
+        </w:rPr>
+        <w:t xml:space="preserve">5 (0.008, 0.5, 1) </w:t>
+      </w:r>
+    </w:p>
+    <w:p>
+      <w:pPr>
+        <w:rPr>
+          <w:lang w:val="en-GB"/>
+        </w:rPr>
+      </w:pPr>
       <w:proofErr w:type="spellStart"/>
       <w:r>
+        <w:rPr>
+          <w:lang w:val="en-GB"/>
+        </w:rPr>
+        <w:t>Mutação</w:t>
+      </w:r>
+      <w:proofErr w:type="spellEnd"/>
+      <w:r>
+        <w:rPr>
+          <w:lang w:val="en-GB"/>
+        </w:rPr>
+        <w:t xml:space="preserve">: </w:t>
+      </w:r>
+      <w:proofErr w:type="spellStart"/>
+      <w:r>
+        <w:rPr>
+          <w:lang w:val="en-GB"/>
+        </w:rPr>
         <w:t>gaussian_mutation</w:t>
       </w:r>
       <w:proofErr w:type="spellEnd"/>
       <w:r>
+        <w:rPr>
+          <w:lang w:val="en-GB"/>
+        </w:rPr>
         <w:t xml:space="preserve">(p) </w:t>
       </w:r>
     </w:p>
@@ -146,7 +192,6 @@
     </w:p>
     <w:p>
       <w:pPr>
-        <w:spacing w:line="240" w:lineRule="auto"/>
         <w:rPr>
           <w:lang w:val="en-GB"/>
         </w:rPr>
@@ -162,34 +207,21 @@
         <w:rPr>
           <w:lang w:val="en-GB"/>
         </w:rPr>
-        <w:t>tournament_</w:t>
-      </w:r>
-      <w:r>
-        <w:rPr>
-          <w:lang w:val="en-GB"/>
-        </w:rPr>
-        <w:t>selection</w:t>
+        <w:t>roulette_wheel_selection</w:t>
       </w:r>
       <w:proofErr w:type="spellEnd"/>
       <w:r>
         <w:rPr>
           <w:lang w:val="en-GB"/>
         </w:rPr>
-        <w:t xml:space="preserve"> (</w:t>
-      </w:r>
-      <w:r>
-        <w:rPr>
-          <w:lang w:val="en-GB"/>
-        </w:rPr>
-        <w:t>population, 10)</w:t>
-      </w:r>
-    </w:p>
-    <w:p>
-      <w:pPr>
-        <w:rPr>
-          <w:lang w:val="en-GB"/>
-        </w:rPr>
-      </w:pPr>
+        <w:t>(population)</w:t>
+      </w:r>
+      <w:r>
+        <w:rPr>
+          <w:lang w:val="en-GB"/>
+        </w:rPr>
+        <w:t xml:space="preserve"> MAU</w:t>
+      </w:r>
     </w:p>
     <w:p>
       <w:pPr>
@@ -203,18 +235,10 @@
           <w:lang w:val="en-GB"/>
         </w:rPr>
         <w:drawing>
-          <wp:anchor distT="0" distB="0" distL="114300" distR="114300" simplePos="0" relativeHeight="251658240" behindDoc="0" locked="0" layoutInCell="1" allowOverlap="1" wp14:anchorId="5DE6B9D4" wp14:editId="72C2CD19">
-            <wp:simplePos x="0" y="0"/>
-            <wp:positionH relativeFrom="column">
-              <wp:posOffset>-48454</wp:posOffset>
-            </wp:positionH>
-            <wp:positionV relativeFrom="paragraph">
-              <wp:posOffset>290581</wp:posOffset>
-            </wp:positionV>
-            <wp:extent cx="5400040" cy="3599815"/>
-            <wp:effectExtent l="0" t="0" r="0" b="635"/>
-            <wp:wrapSquare wrapText="bothSides"/>
-            <wp:docPr id="1775275997" name="Imagem 1"/>
+          <wp:inline distT="0" distB="0" distL="0" distR="0" wp14:anchorId="23D7FC93" wp14:editId="57BA4FA5">
+            <wp:extent cx="5025225" cy="3349953"/>
+            <wp:effectExtent l="0" t="0" r="4445" b="3175"/>
+            <wp:docPr id="1398085898" name="Imagem 1"/>
             <wp:cNvGraphicFramePr>
               <a:graphicFrameLocks xmlns:a="http://schemas.openxmlformats.org/drawingml/2006/main" noChangeAspect="1"/>
             </wp:cNvGraphicFramePr>
@@ -222,11 +246,197 @@
               <a:graphicData uri="http://schemas.openxmlformats.org/drawingml/2006/picture">
                 <pic:pic xmlns:pic="http://schemas.openxmlformats.org/drawingml/2006/picture">
                   <pic:nvPicPr>
-                    <pic:cNvPr id="1775275997" name="Imagem 1775275997"/>
+                    <pic:cNvPr id="1398085898" name="Imagem 1398085898"/>
                     <pic:cNvPicPr/>
                   </pic:nvPicPr>
                   <pic:blipFill>
                     <a:blip r:embed="rId6" cstate="print">
+                      <a:extLst>
+                        <a:ext uri="{28A0092B-C50C-407E-A947-70E740481C1C}">
+                          <a14:useLocalDpi xmlns:a14="http://schemas.microsoft.com/office/drawing/2010/main" val="0"/>
+                        </a:ext>
+                      </a:extLst>
+                    </a:blip>
+                    <a:stretch>
+                      <a:fillRect/>
+                    </a:stretch>
+                  </pic:blipFill>
+                  <pic:spPr>
+                    <a:xfrm>
+                      <a:off x="0" y="0"/>
+                      <a:ext cx="5028165" cy="3351913"/>
+                    </a:xfrm>
+                    <a:prstGeom prst="rect">
+                      <a:avLst/>
+                    </a:prstGeom>
+                  </pic:spPr>
+                </pic:pic>
+              </a:graphicData>
+            </a:graphic>
+          </wp:inline>
+        </w:drawing>
+      </w:r>
+    </w:p>
+    <w:p>
+      <w:pPr>
+        <w:rPr>
+          <w:lang w:val="en-GB"/>
+        </w:rPr>
+      </w:pPr>
+    </w:p>
+    <w:p>
+      <w:pPr>
+        <w:rPr>
+          <w:lang w:val="en-GB"/>
+        </w:rPr>
+      </w:pPr>
+      <w:proofErr w:type="spellStart"/>
+      <w:r>
+        <w:rPr>
+          <w:lang w:val="en-GB"/>
+        </w:rPr>
+        <w:t>Mutação</w:t>
+      </w:r>
+      <w:proofErr w:type="spellEnd"/>
+      <w:r>
+        <w:rPr>
+          <w:lang w:val="en-GB"/>
+        </w:rPr>
+        <w:t xml:space="preserve">: </w:t>
+      </w:r>
+      <w:proofErr w:type="spellStart"/>
+      <w:r>
+        <w:rPr>
+          <w:lang w:val="en-GB"/>
+        </w:rPr>
+        <w:t>gaussian_mutation</w:t>
+      </w:r>
+      <w:proofErr w:type="spellEnd"/>
+      <w:r>
+        <w:rPr>
+          <w:lang w:val="en-GB"/>
+        </w:rPr>
+        <w:t xml:space="preserve">(p) </w:t>
+      </w:r>
+    </w:p>
+    <w:p>
+      <w:pPr>
+        <w:spacing w:line="240" w:lineRule="auto"/>
+        <w:rPr>
+          <w:lang w:val="en-GB"/>
+        </w:rPr>
+      </w:pPr>
+      <w:r>
+        <w:rPr>
+          <w:lang w:val="en-GB"/>
+        </w:rPr>
+        <w:t>Crossover</w:t>
+      </w:r>
+      <w:r>
+        <w:rPr>
+          <w:lang w:val="en-GB"/>
+        </w:rPr>
+        <w:t xml:space="preserve">: </w:t>
+      </w:r>
+      <w:proofErr w:type="spellStart"/>
+      <w:r>
+        <w:rPr>
+          <w:lang w:val="en-GB"/>
+        </w:rPr>
+        <w:t>aritmetico</w:t>
+      </w:r>
+      <w:proofErr w:type="spellEnd"/>
+      <w:r>
+        <w:rPr>
+          <w:lang w:val="en-GB"/>
+        </w:rPr>
+        <w:t xml:space="preserve"> </w:t>
+      </w:r>
+      <w:r>
+        <w:rPr>
+          <w:lang w:val="en-GB"/>
+        </w:rPr>
+        <w:t>(p1, p2)</w:t>
+      </w:r>
+    </w:p>
+    <w:p>
+      <w:pPr>
+        <w:rPr>
+          <w:lang w:val="en-GB"/>
+        </w:rPr>
+      </w:pPr>
+      <w:r>
+        <w:rPr>
+          <w:lang w:val="en-GB"/>
+        </w:rPr>
+        <w:t xml:space="preserve">Parent Selection: </w:t>
+      </w:r>
+      <w:proofErr w:type="spellStart"/>
+      <w:r>
+        <w:rPr>
+          <w:lang w:val="en-GB"/>
+        </w:rPr>
+        <w:t>roulette_wheel_selection</w:t>
+      </w:r>
+      <w:proofErr w:type="spellEnd"/>
+      <w:r>
+        <w:rPr>
+          <w:lang w:val="en-GB"/>
+        </w:rPr>
+        <w:t>(population)</w:t>
+      </w:r>
+      <w:r>
+        <w:rPr>
+          <w:lang w:val="en-GB"/>
+        </w:rPr>
+        <w:t xml:space="preserve"> MAU</w:t>
+      </w:r>
+    </w:p>
+    <w:p>
+      <w:r>
+        <w:t xml:space="preserve">Já se prova que </w:t>
+      </w:r>
+      <w:r>
+        <w:t xml:space="preserve">não se usa aritmético em detrimento de </w:t>
+      </w:r>
+      <w:proofErr w:type="spellStart"/>
+      <w:r>
+        <w:t>two-point</w:t>
+      </w:r>
+      <w:proofErr w:type="spellEnd"/>
+      <w:r>
+        <w:t>. O aritmético altera muito a informação genética com as combinações lineares, não preservando muito.</w:t>
+      </w:r>
+    </w:p>
+    <w:p>
+      <w:pPr>
+        <w:rPr>
+          <w:lang w:val="en-GB"/>
+        </w:rPr>
+      </w:pPr>
+      <w:r>
+        <w:rPr>
+          <w:noProof/>
+          <w:lang w:val="en-GB"/>
+        </w:rPr>
+        <w:lastRenderedPageBreak/>
+        <w:drawing>
+          <wp:inline distT="0" distB="0" distL="0" distR="0" wp14:anchorId="7A3D85D6" wp14:editId="5F636A26">
+            <wp:extent cx="5400040" cy="3599815"/>
+            <wp:effectExtent l="0" t="0" r="0" b="635"/>
+            <wp:docPr id="276301880" name="Imagem 2"/>
+            <wp:cNvGraphicFramePr>
+              <a:graphicFrameLocks xmlns:a="http://schemas.openxmlformats.org/drawingml/2006/main" noChangeAspect="1"/>
+            </wp:cNvGraphicFramePr>
+            <a:graphic xmlns:a="http://schemas.openxmlformats.org/drawingml/2006/main">
+              <a:graphicData uri="http://schemas.openxmlformats.org/drawingml/2006/picture">
+                <pic:pic xmlns:pic="http://schemas.openxmlformats.org/drawingml/2006/picture">
+                  <pic:nvPicPr>
+                    <pic:cNvPr id="276301880" name="Imagem 276301880"/>
+                    <pic:cNvPicPr/>
+                  </pic:nvPicPr>
+                  <pic:blipFill>
+                    <a:blip r:embed="rId7" cstate="print">
                       <a:extLst>
                         <a:ext uri="{28A0092B-C50C-407E-A947-70E740481C1C}">
                           <a14:useLocalDpi xmlns:a14="http://schemas.microsoft.com/office/drawing/2010/main" val="0"/>
@@ -249,9 +459,865 @@
                 </pic:pic>
               </a:graphicData>
             </a:graphic>
-          </wp:anchor>
+          </wp:inline>
         </w:drawing>
       </w:r>
+    </w:p>
+    <w:p>
+      <w:pPr>
+        <w:rPr>
+          <w:lang w:val="en-GB"/>
+        </w:rPr>
+      </w:pPr>
+    </w:p>
+    <w:p>
+      <w:pPr>
+        <w:rPr>
+          <w:lang w:val="en-GB"/>
+        </w:rPr>
+      </w:pPr>
+      <w:proofErr w:type="spellStart"/>
+      <w:r>
+        <w:rPr>
+          <w:lang w:val="en-GB"/>
+        </w:rPr>
+        <w:t>Mutação</w:t>
+      </w:r>
+      <w:proofErr w:type="spellEnd"/>
+      <w:r>
+        <w:rPr>
+          <w:lang w:val="en-GB"/>
+        </w:rPr>
+        <w:t xml:space="preserve">: </w:t>
+      </w:r>
+      <w:proofErr w:type="spellStart"/>
+      <w:r>
+        <w:rPr>
+          <w:lang w:val="en-GB"/>
+        </w:rPr>
+        <w:t>uniform</w:t>
+      </w:r>
+      <w:r>
+        <w:rPr>
+          <w:lang w:val="en-GB"/>
+        </w:rPr>
+        <w:t>_mutation</w:t>
+      </w:r>
+      <w:proofErr w:type="spellEnd"/>
+      <w:r>
+        <w:rPr>
+          <w:lang w:val="en-GB"/>
+        </w:rPr>
+        <w:t xml:space="preserve">(p) </w:t>
+      </w:r>
+    </w:p>
+    <w:p>
+      <w:pPr>
+        <w:spacing w:line="240" w:lineRule="auto"/>
+        <w:rPr>
+          <w:lang w:val="en-GB"/>
+        </w:rPr>
+      </w:pPr>
+      <w:r>
+        <w:rPr>
+          <w:lang w:val="en-GB"/>
+        </w:rPr>
+        <w:t>Crossover</w:t>
+      </w:r>
+      <w:r>
+        <w:rPr>
+          <w:lang w:val="en-GB"/>
+        </w:rPr>
+        <w:t xml:space="preserve">: </w:t>
+      </w:r>
+      <w:proofErr w:type="spellStart"/>
+      <w:r>
+        <w:rPr>
+          <w:lang w:val="en-GB"/>
+        </w:rPr>
+        <w:t>two_point</w:t>
+      </w:r>
+      <w:r>
+        <w:rPr>
+          <w:lang w:val="en-GB"/>
+        </w:rPr>
+        <w:t>_crossover</w:t>
+      </w:r>
+      <w:proofErr w:type="spellEnd"/>
+      <w:r>
+        <w:rPr>
+          <w:lang w:val="en-GB"/>
+        </w:rPr>
+        <w:t xml:space="preserve"> (p1, p2)</w:t>
+      </w:r>
+    </w:p>
+    <w:p>
+      <w:pPr>
+        <w:rPr>
+          <w:lang w:val="en-GB"/>
+        </w:rPr>
+      </w:pPr>
+      <w:r>
+        <w:rPr>
+          <w:lang w:val="en-GB"/>
+        </w:rPr>
+        <w:t>Parent Selection</w:t>
+      </w:r>
+      <w:r>
+        <w:rPr>
+          <w:lang w:val="en-GB"/>
+        </w:rPr>
+        <w:t xml:space="preserve">: </w:t>
+      </w:r>
+      <w:proofErr w:type="spellStart"/>
+      <w:r>
+        <w:rPr>
+          <w:lang w:val="en-GB"/>
+        </w:rPr>
+        <w:t>tournament</w:t>
+      </w:r>
+      <w:r>
+        <w:rPr>
+          <w:lang w:val="en-GB"/>
+        </w:rPr>
+        <w:t>_</w:t>
+      </w:r>
+      <w:proofErr w:type="gramStart"/>
+      <w:r>
+        <w:rPr>
+          <w:lang w:val="en-GB"/>
+        </w:rPr>
+        <w:t>selection</w:t>
+      </w:r>
+      <w:proofErr w:type="spellEnd"/>
+      <w:r>
+        <w:rPr>
+          <w:lang w:val="en-GB"/>
+        </w:rPr>
+        <w:t>(</w:t>
+      </w:r>
+      <w:proofErr w:type="gramEnd"/>
+      <w:r>
+        <w:rPr>
+          <w:lang w:val="en-GB"/>
+        </w:rPr>
+        <w:t>population</w:t>
+      </w:r>
+      <w:r>
+        <w:rPr>
+          <w:lang w:val="en-GB"/>
+        </w:rPr>
+        <w:t>, k = 10</w:t>
+      </w:r>
+      <w:r>
+        <w:rPr>
+          <w:lang w:val="en-GB"/>
+        </w:rPr>
+        <w:t>)</w:t>
+      </w:r>
+      <w:r>
+        <w:rPr>
+          <w:lang w:val="en-GB"/>
+        </w:rPr>
+        <w:t xml:space="preserve"> MAU</w:t>
+      </w:r>
+    </w:p>
+    <w:p>
+      <w:pPr>
+        <w:rPr>
+          <w:lang w:val="en-GB"/>
+        </w:rPr>
+      </w:pPr>
+      <w:r>
+        <w:rPr>
+          <w:noProof/>
+          <w:lang w:val="en-GB"/>
+        </w:rPr>
+        <w:drawing>
+          <wp:inline distT="0" distB="0" distL="0" distR="0" wp14:anchorId="3DEAC4D5" wp14:editId="7432FBD7">
+            <wp:extent cx="5400040" cy="3599815"/>
+            <wp:effectExtent l="0" t="0" r="0" b="635"/>
+            <wp:docPr id="727482662" name="Imagem 3"/>
+            <wp:cNvGraphicFramePr>
+              <a:graphicFrameLocks xmlns:a="http://schemas.openxmlformats.org/drawingml/2006/main" noChangeAspect="1"/>
+            </wp:cNvGraphicFramePr>
+            <a:graphic xmlns:a="http://schemas.openxmlformats.org/drawingml/2006/main">
+              <a:graphicData uri="http://schemas.openxmlformats.org/drawingml/2006/picture">
+                <pic:pic xmlns:pic="http://schemas.openxmlformats.org/drawingml/2006/picture">
+                  <pic:nvPicPr>
+                    <pic:cNvPr id="727482662" name="Imagem 727482662"/>
+                    <pic:cNvPicPr/>
+                  </pic:nvPicPr>
+                  <pic:blipFill>
+                    <a:blip r:embed="rId8" cstate="print">
+                      <a:extLst>
+                        <a:ext uri="{28A0092B-C50C-407E-A947-70E740481C1C}">
+                          <a14:useLocalDpi xmlns:a14="http://schemas.microsoft.com/office/drawing/2010/main" val="0"/>
+                        </a:ext>
+                      </a:extLst>
+                    </a:blip>
+                    <a:stretch>
+                      <a:fillRect/>
+                    </a:stretch>
+                  </pic:blipFill>
+                  <pic:spPr>
+                    <a:xfrm>
+                      <a:off x="0" y="0"/>
+                      <a:ext cx="5400040" cy="3599815"/>
+                    </a:xfrm>
+                    <a:prstGeom prst="rect">
+                      <a:avLst/>
+                    </a:prstGeom>
+                  </pic:spPr>
+                </pic:pic>
+              </a:graphicData>
+            </a:graphic>
+          </wp:inline>
+        </w:drawing>
+      </w:r>
+    </w:p>
+    <w:p>
+      <w:pPr>
+        <w:rPr>
+          <w:lang w:val="en-GB"/>
+        </w:rPr>
+      </w:pPr>
+    </w:p>
+    <w:p>
+      <w:r>
+        <w:lastRenderedPageBreak/>
+        <w:t>Agora o foco é resolver t</w:t>
+      </w:r>
+      <w:r>
+        <w:t>odos os testes que têm a ver com a combinação:</w:t>
+      </w:r>
+    </w:p>
+    <w:p>
+      <w:pPr>
+        <w:rPr>
+          <w:lang w:val="en-GB"/>
+        </w:rPr>
+      </w:pPr>
+      <w:proofErr w:type="spellStart"/>
+      <w:r>
+        <w:rPr>
+          <w:lang w:val="en-GB"/>
+        </w:rPr>
+        <w:t>Turnament</w:t>
+      </w:r>
+      <w:proofErr w:type="spellEnd"/>
+      <w:r>
+        <w:rPr>
+          <w:lang w:val="en-GB"/>
+        </w:rPr>
+        <w:t xml:space="preserve">, </w:t>
+      </w:r>
+      <w:proofErr w:type="spellStart"/>
+      <w:r>
+        <w:rPr>
+          <w:lang w:val="en-GB"/>
+        </w:rPr>
+        <w:t>two_point</w:t>
+      </w:r>
+      <w:proofErr w:type="spellEnd"/>
+      <w:r>
+        <w:rPr>
+          <w:lang w:val="en-GB"/>
+        </w:rPr>
+        <w:t xml:space="preserve"> e </w:t>
+      </w:r>
+      <w:proofErr w:type="spellStart"/>
+      <w:r>
+        <w:rPr>
+          <w:lang w:val="en-GB"/>
+        </w:rPr>
+        <w:t>gaussian_</w:t>
+      </w:r>
+      <w:r>
+        <w:rPr>
+          <w:lang w:val="en-GB"/>
+        </w:rPr>
+        <w:t>mutation</w:t>
+      </w:r>
+      <w:proofErr w:type="spellEnd"/>
+    </w:p>
+    <w:p>
+      <w:pPr>
+        <w:rPr>
+          <w:lang w:val="en-GB"/>
+        </w:rPr>
+      </w:pPr>
+      <w:r>
+        <w:rPr>
+          <w:lang w:val="en-GB"/>
+        </w:rPr>
+        <w:t xml:space="preserve">EXPERIENCIA 6 </w:t>
+      </w:r>
+    </w:p>
+    <w:p>
+      <w:pPr>
+        <w:rPr>
+          <w:lang w:val="en-GB"/>
+        </w:rPr>
+      </w:pPr>
+      <w:proofErr w:type="spellStart"/>
+      <w:r>
+        <w:rPr>
+          <w:lang w:val="en-GB"/>
+        </w:rPr>
+        <w:t>Mutação</w:t>
+      </w:r>
+      <w:proofErr w:type="spellEnd"/>
+      <w:r>
+        <w:rPr>
+          <w:lang w:val="en-GB"/>
+        </w:rPr>
+        <w:t xml:space="preserve">: </w:t>
+      </w:r>
+      <w:proofErr w:type="spellStart"/>
+      <w:r>
+        <w:rPr>
+          <w:lang w:val="en-GB"/>
+        </w:rPr>
+        <w:t>gaussian_mutation</w:t>
+      </w:r>
+      <w:proofErr w:type="spellEnd"/>
+      <w:r>
+        <w:rPr>
+          <w:lang w:val="en-GB"/>
+        </w:rPr>
+        <w:t xml:space="preserve">(p) </w:t>
+      </w:r>
+    </w:p>
+    <w:p>
+      <w:pPr>
+        <w:spacing w:line="240" w:lineRule="auto"/>
+        <w:rPr>
+          <w:lang w:val="en-GB"/>
+        </w:rPr>
+      </w:pPr>
+      <w:r>
+        <w:rPr>
+          <w:lang w:val="en-GB"/>
+        </w:rPr>
+        <w:t xml:space="preserve">Crossover: </w:t>
+      </w:r>
+      <w:proofErr w:type="spellStart"/>
+      <w:r>
+        <w:rPr>
+          <w:lang w:val="en-GB"/>
+        </w:rPr>
+        <w:t>Two_point_</w:t>
+      </w:r>
+      <w:proofErr w:type="gramStart"/>
+      <w:r>
+        <w:rPr>
+          <w:lang w:val="en-GB"/>
+        </w:rPr>
+        <w:t>Crossover</w:t>
+      </w:r>
+      <w:proofErr w:type="spellEnd"/>
+      <w:r>
+        <w:rPr>
+          <w:lang w:val="en-GB"/>
+        </w:rPr>
+        <w:t>(</w:t>
+      </w:r>
+      <w:proofErr w:type="gramEnd"/>
+      <w:r>
+        <w:rPr>
+          <w:lang w:val="en-GB"/>
+        </w:rPr>
+        <w:t>p1, p2)</w:t>
+      </w:r>
+    </w:p>
+    <w:p>
+      <w:pPr>
+        <w:spacing w:line="240" w:lineRule="auto"/>
+        <w:rPr>
+          <w:lang w:val="en-GB"/>
+        </w:rPr>
+      </w:pPr>
+      <w:r>
+        <w:rPr>
+          <w:lang w:val="en-GB"/>
+        </w:rPr>
+        <w:t xml:space="preserve">Parent Selection: </w:t>
+      </w:r>
+      <w:proofErr w:type="spellStart"/>
+      <w:r>
+        <w:rPr>
+          <w:lang w:val="en-GB"/>
+        </w:rPr>
+        <w:t>tournament_selection</w:t>
+      </w:r>
+      <w:proofErr w:type="spellEnd"/>
+      <w:r>
+        <w:rPr>
+          <w:lang w:val="en-GB"/>
+        </w:rPr>
+        <w:t xml:space="preserve"> (population, </w:t>
+      </w:r>
+      <w:r>
+        <w:rPr>
+          <w:lang w:val="en-GB"/>
+        </w:rPr>
+        <w:t>20</w:t>
+      </w:r>
+      <w:r>
+        <w:rPr>
+          <w:lang w:val="en-GB"/>
+        </w:rPr>
+        <w:t>)</w:t>
+      </w:r>
+      <w:r>
+        <w:rPr>
+          <w:lang w:val="en-GB"/>
+        </w:rPr>
+        <w:t xml:space="preserve"> BOM</w:t>
+      </w:r>
+    </w:p>
+    <w:p>
+      <w:pPr>
+        <w:spacing w:line="240" w:lineRule="auto"/>
+        <w:rPr>
+          <w:lang w:val="en-GB"/>
+        </w:rPr>
+      </w:pPr>
+      <w:r>
+        <w:rPr>
+          <w:noProof/>
+          <w:lang w:val="en-GB"/>
+        </w:rPr>
+        <w:drawing>
+          <wp:inline distT="0" distB="0" distL="0" distR="0" wp14:anchorId="5DCE8F1E" wp14:editId="3A945BDE">
+            <wp:extent cx="5400040" cy="3599815"/>
+            <wp:effectExtent l="0" t="0" r="0" b="635"/>
+            <wp:docPr id="1679859955" name="Imagem 4"/>
+            <wp:cNvGraphicFramePr>
+              <a:graphicFrameLocks xmlns:a="http://schemas.openxmlformats.org/drawingml/2006/main" noChangeAspect="1"/>
+            </wp:cNvGraphicFramePr>
+            <a:graphic xmlns:a="http://schemas.openxmlformats.org/drawingml/2006/main">
+              <a:graphicData uri="http://schemas.openxmlformats.org/drawingml/2006/picture">
+                <pic:pic xmlns:pic="http://schemas.openxmlformats.org/drawingml/2006/picture">
+                  <pic:nvPicPr>
+                    <pic:cNvPr id="1679859955" name="Imagem 1679859955"/>
+                    <pic:cNvPicPr/>
+                  </pic:nvPicPr>
+                  <pic:blipFill>
+                    <a:blip r:embed="rId9" cstate="print">
+                      <a:extLst>
+                        <a:ext uri="{28A0092B-C50C-407E-A947-70E740481C1C}">
+                          <a14:useLocalDpi xmlns:a14="http://schemas.microsoft.com/office/drawing/2010/main" val="0"/>
+                        </a:ext>
+                      </a:extLst>
+                    </a:blip>
+                    <a:stretch>
+                      <a:fillRect/>
+                    </a:stretch>
+                  </pic:blipFill>
+                  <pic:spPr>
+                    <a:xfrm>
+                      <a:off x="0" y="0"/>
+                      <a:ext cx="5400040" cy="3599815"/>
+                    </a:xfrm>
+                    <a:prstGeom prst="rect">
+                      <a:avLst/>
+                    </a:prstGeom>
+                  </pic:spPr>
+                </pic:pic>
+              </a:graphicData>
+            </a:graphic>
+          </wp:inline>
+        </w:drawing>
+      </w:r>
+    </w:p>
+    <w:p>
+      <w:pPr>
+        <w:rPr>
+          <w:lang w:val="en-GB"/>
+        </w:rPr>
+      </w:pPr>
+    </w:p>
+    <w:p>
+      <w:pPr>
+        <w:rPr>
+          <w:lang w:val="en-GB"/>
+        </w:rPr>
+      </w:pPr>
+    </w:p>
+    <w:p>
+      <w:pPr>
+        <w:rPr>
+          <w:lang w:val="en-GB"/>
+        </w:rPr>
+      </w:pPr>
+    </w:p>
+    <w:p>
+      <w:pPr>
+        <w:rPr>
+          <w:lang w:val="en-GB"/>
+        </w:rPr>
+      </w:pPr>
+    </w:p>
+    <w:p>
+      <w:pPr>
+        <w:rPr>
+          <w:lang w:val="en-GB"/>
+        </w:rPr>
+      </w:pPr>
+    </w:p>
+    <w:p>
+      <w:pPr>
+        <w:rPr>
+          <w:lang w:val="en-GB"/>
+        </w:rPr>
+      </w:pPr>
+    </w:p>
+    <w:p>
+      <w:pPr>
+        <w:rPr>
+          <w:lang w:val="en-GB"/>
+        </w:rPr>
+      </w:pPr>
+    </w:p>
+    <w:p>
+      <w:pPr>
+        <w:rPr>
+          <w:lang w:val="en-GB"/>
+        </w:rPr>
+      </w:pPr>
+    </w:p>
+    <w:p>
+      <w:pPr>
+        <w:rPr>
+          <w:lang w:val="en-GB"/>
+        </w:rPr>
+      </w:pPr>
+    </w:p>
+    <w:p>
+      <w:pPr>
+        <w:rPr>
+          <w:lang w:val="en-GB"/>
+        </w:rPr>
+      </w:pPr>
+    </w:p>
+    <w:p>
+      <w:pPr>
+        <w:rPr>
+          <w:lang w:val="en-GB"/>
+        </w:rPr>
+      </w:pPr>
+    </w:p>
+    <w:p>
+      <w:pPr>
+        <w:rPr>
+          <w:lang w:val="en-GB"/>
+        </w:rPr>
+      </w:pPr>
+    </w:p>
+    <w:p>
+      <w:pPr>
+        <w:rPr>
+          <w:lang w:val="en-GB"/>
+        </w:rPr>
+      </w:pPr>
+      <w:r>
+        <w:rPr>
+          <w:lang w:val="en-GB"/>
+        </w:rPr>
+        <w:lastRenderedPageBreak/>
+        <w:t xml:space="preserve">EXPERIENCIA </w:t>
+      </w:r>
+      <w:r>
+        <w:rPr>
+          <w:lang w:val="en-GB"/>
+        </w:rPr>
+        <w:t>7</w:t>
+      </w:r>
+    </w:p>
+    <w:p>
+      <w:pPr>
+        <w:rPr>
+          <w:lang w:val="en-GB"/>
+        </w:rPr>
+      </w:pPr>
+      <w:proofErr w:type="spellStart"/>
+      <w:r>
+        <w:rPr>
+          <w:lang w:val="en-GB"/>
+        </w:rPr>
+        <w:t>Mutação</w:t>
+      </w:r>
+      <w:proofErr w:type="spellEnd"/>
+      <w:r>
+        <w:rPr>
+          <w:lang w:val="en-GB"/>
+        </w:rPr>
+        <w:t xml:space="preserve">: </w:t>
+      </w:r>
+      <w:proofErr w:type="spellStart"/>
+      <w:r>
+        <w:rPr>
+          <w:lang w:val="en-GB"/>
+        </w:rPr>
+        <w:t>gaussian_mutation</w:t>
+      </w:r>
+      <w:proofErr w:type="spellEnd"/>
+      <w:r>
+        <w:rPr>
+          <w:lang w:val="en-GB"/>
+        </w:rPr>
+        <w:t xml:space="preserve">(p) </w:t>
+      </w:r>
+    </w:p>
+    <w:p>
+      <w:pPr>
+        <w:spacing w:line="240" w:lineRule="auto"/>
+        <w:rPr>
+          <w:lang w:val="en-GB"/>
+        </w:rPr>
+      </w:pPr>
+      <w:r>
+        <w:rPr>
+          <w:lang w:val="en-GB"/>
+        </w:rPr>
+        <w:t xml:space="preserve">Crossover: </w:t>
+      </w:r>
+      <w:proofErr w:type="spellStart"/>
+      <w:r>
+        <w:rPr>
+          <w:lang w:val="en-GB"/>
+        </w:rPr>
+        <w:t>Two_point_</w:t>
+      </w:r>
+      <w:proofErr w:type="gramStart"/>
+      <w:r>
+        <w:rPr>
+          <w:lang w:val="en-GB"/>
+        </w:rPr>
+        <w:t>Crossover</w:t>
+      </w:r>
+      <w:proofErr w:type="spellEnd"/>
+      <w:r>
+        <w:rPr>
+          <w:lang w:val="en-GB"/>
+        </w:rPr>
+        <w:t>(</w:t>
+      </w:r>
+      <w:proofErr w:type="gramEnd"/>
+      <w:r>
+        <w:rPr>
+          <w:lang w:val="en-GB"/>
+        </w:rPr>
+        <w:t>p1, p2)</w:t>
+      </w:r>
+    </w:p>
+    <w:p>
+      <w:pPr>
+        <w:spacing w:line="240" w:lineRule="auto"/>
+        <w:rPr>
+          <w:lang w:val="en-GB"/>
+        </w:rPr>
+      </w:pPr>
+      <w:r>
+        <w:rPr>
+          <w:lang w:val="en-GB"/>
+        </w:rPr>
+        <w:t xml:space="preserve">Parent Selection: </w:t>
+      </w:r>
+      <w:proofErr w:type="spellStart"/>
+      <w:r>
+        <w:rPr>
+          <w:lang w:val="en-GB"/>
+        </w:rPr>
+        <w:t>tournament_selection</w:t>
+      </w:r>
+      <w:proofErr w:type="spellEnd"/>
+      <w:r>
+        <w:rPr>
+          <w:lang w:val="en-GB"/>
+        </w:rPr>
+        <w:t xml:space="preserve"> (population, </w:t>
+      </w:r>
+      <w:r>
+        <w:rPr>
+          <w:lang w:val="en-GB"/>
+        </w:rPr>
+        <w:t>20</w:t>
+      </w:r>
+      <w:r>
+        <w:rPr>
+          <w:lang w:val="en-GB"/>
+        </w:rPr>
+        <w:t>)</w:t>
+      </w:r>
+      <w:r>
+        <w:rPr>
+          <w:lang w:val="en-GB"/>
+        </w:rPr>
+        <w:t xml:space="preserve"> </w:t>
+      </w:r>
+      <w:r>
+        <w:rPr>
+          <w:lang w:val="en-GB"/>
+        </w:rPr>
+        <w:t xml:space="preserve">Mais </w:t>
+      </w:r>
+      <w:proofErr w:type="spellStart"/>
+      <w:r>
+        <w:rPr>
+          <w:lang w:val="en-GB"/>
+        </w:rPr>
+        <w:t>ou</w:t>
+      </w:r>
+      <w:proofErr w:type="spellEnd"/>
+      <w:r>
+        <w:rPr>
+          <w:lang w:val="en-GB"/>
+        </w:rPr>
+        <w:t xml:space="preserve"> </w:t>
+      </w:r>
+      <w:proofErr w:type="spellStart"/>
+      <w:r>
+        <w:rPr>
+          <w:lang w:val="en-GB"/>
+        </w:rPr>
+        <w:t>menos</w:t>
+      </w:r>
+      <w:proofErr w:type="spellEnd"/>
+    </w:p>
+    <w:p>
+      <w:pPr>
+        <w:spacing w:line="240" w:lineRule="auto"/>
+        <w:rPr>
+          <w:lang w:val="en-GB"/>
+        </w:rPr>
+      </w:pPr>
+    </w:p>
+    <w:p>
+      <w:pPr>
+        <w:rPr>
+          <w:lang w:val="en-GB"/>
+        </w:rPr>
+      </w:pPr>
+      <w:r>
+        <w:rPr>
+          <w:noProof/>
+          <w:lang w:val="en-GB"/>
+        </w:rPr>
+        <w:drawing>
+          <wp:inline distT="0" distB="0" distL="0" distR="0" wp14:anchorId="0BC87AB3" wp14:editId="62D1B998">
+            <wp:extent cx="5057030" cy="3371155"/>
+            <wp:effectExtent l="0" t="0" r="0" b="1270"/>
+            <wp:docPr id="1898657305" name="Imagem 5"/>
+            <wp:cNvGraphicFramePr>
+              <a:graphicFrameLocks xmlns:a="http://schemas.openxmlformats.org/drawingml/2006/main" noChangeAspect="1"/>
+            </wp:cNvGraphicFramePr>
+            <a:graphic xmlns:a="http://schemas.openxmlformats.org/drawingml/2006/main">
+              <a:graphicData uri="http://schemas.openxmlformats.org/drawingml/2006/picture">
+                <pic:pic xmlns:pic="http://schemas.openxmlformats.org/drawingml/2006/picture">
+                  <pic:nvPicPr>
+                    <pic:cNvPr id="1898657305" name="Imagem 1898657305"/>
+                    <pic:cNvPicPr/>
+                  </pic:nvPicPr>
+                  <pic:blipFill>
+                    <a:blip r:embed="rId10" cstate="print">
+                      <a:extLst>
+                        <a:ext uri="{28A0092B-C50C-407E-A947-70E740481C1C}">
+                          <a14:useLocalDpi xmlns:a14="http://schemas.microsoft.com/office/drawing/2010/main" val="0"/>
+                        </a:ext>
+                      </a:extLst>
+                    </a:blip>
+                    <a:stretch>
+                      <a:fillRect/>
+                    </a:stretch>
+                  </pic:blipFill>
+                  <pic:spPr>
+                    <a:xfrm>
+                      <a:off x="0" y="0"/>
+                      <a:ext cx="5063073" cy="3375184"/>
+                    </a:xfrm>
+                    <a:prstGeom prst="rect">
+                      <a:avLst/>
+                    </a:prstGeom>
+                  </pic:spPr>
+                </pic:pic>
+              </a:graphicData>
+            </a:graphic>
+          </wp:inline>
+        </w:drawing>
+      </w:r>
+    </w:p>
+    <w:p>
+      <w:pPr>
+        <w:rPr>
+          <w:lang w:val="en-GB"/>
+        </w:rPr>
+      </w:pPr>
+    </w:p>
+    <w:p>
+      <w:pPr>
+        <w:rPr>
+          <w:lang w:val="en-GB"/>
+        </w:rPr>
+      </w:pPr>
+    </w:p>
+    <w:p>
+      <w:pPr>
+        <w:rPr>
+          <w:lang w:val="en-GB"/>
+        </w:rPr>
+      </w:pPr>
+    </w:p>
+    <w:p>
+      <w:pPr>
+        <w:rPr>
+          <w:lang w:val="en-GB"/>
+        </w:rPr>
+      </w:pPr>
+    </w:p>
+    <w:p>
+      <w:pPr>
+        <w:rPr>
+          <w:lang w:val="en-GB"/>
+        </w:rPr>
+      </w:pPr>
+    </w:p>
+    <w:p>
+      <w:pPr>
+        <w:rPr>
+          <w:lang w:val="en-GB"/>
+        </w:rPr>
+      </w:pPr>
+    </w:p>
+    <w:p>
+      <w:pPr>
+        <w:rPr>
+          <w:lang w:val="en-GB"/>
+        </w:rPr>
+      </w:pPr>
+    </w:p>
+    <w:p>
+      <w:pPr>
+        <w:rPr>
+          <w:lang w:val="en-GB"/>
+        </w:rPr>
+      </w:pPr>
+    </w:p>
+    <w:p>
+      <w:pPr>
+        <w:rPr>
+          <w:lang w:val="en-GB"/>
+        </w:rPr>
+      </w:pPr>
+    </w:p>
+    <w:p>
+      <w:pPr>
+        <w:rPr>
+          <w:lang w:val="en-GB"/>
+        </w:rPr>
+      </w:pPr>
     </w:p>
     <w:p>
       <w:pPr>
@@ -791,6 +1857,7 @@
   <w:style w:type="paragraph" w:default="1" w:styleId="Normal">
     <w:name w:val="Normal"/>
     <w:qFormat/>
+    <w:rsid w:val="00C8722C"/>
   </w:style>
   <w:style w:type="paragraph" w:styleId="Ttulo1">
     <w:name w:val="heading 1"/>

</xml_diff>